<commit_message>
Fix web viewport scrolling, React 19 package compatibility, and web-safe Alert utility
</commit_message>
<xml_diff>
--- a/StationAI_Antigravity_Prompt_v2_Plain.docx
+++ b/StationAI_Antigravity_Prompt_v2_Plain.docx
@@ -2579,10 +2579,7 @@
       </w:r>
       <w:proofErr w:type="gramEnd"/>
       <w:r>
-        <w:t xml:space="preserve"> good libraries </w:t>
-      </w:r>
-      <w:r>
-        <w:t xml:space="preserve"> </w:t>
+        <w:t xml:space="preserve"> good libraries  </w:t>
       </w:r>
     </w:p>
     <w:p>
@@ -6749,6 +6746,10 @@
       <w:pPr>
         <w:spacing w:before="400"/>
         <w:jc w:val="center"/>
+        <w:rPr>
+          <w:sz w:val="18"/>
+          <w:szCs w:val="18"/>
+        </w:rPr>
       </w:pPr>
       <w:proofErr w:type="spellStart"/>
       <w:r>
@@ -6798,6 +6799,46 @@
         </w:rPr>
         <w:t xml:space="preserve">  May 2026</w:t>
       </w:r>
+    </w:p>
+    <w:p>
+      <w:pPr>
+        <w:spacing w:before="400"/>
+        <w:rPr>
+          <w:sz w:val="18"/>
+          <w:szCs w:val="18"/>
+        </w:rPr>
+      </w:pPr>
+      <w:r>
+        <w:rPr>
+          <w:sz w:val="18"/>
+          <w:szCs w:val="18"/>
+        </w:rPr>
+        <w:br/>
+        <w:t>cd "f:\station-ai MVP\backend"</w:t>
+      </w:r>
+      <w:r>
+        <w:rPr>
+          <w:sz w:val="18"/>
+          <w:szCs w:val="18"/>
+        </w:rPr>
+        <w:t xml:space="preserve"> </w:t>
+      </w:r>
+      <w:r>
+        <w:rPr>
+          <w:sz w:val="18"/>
+          <w:szCs w:val="18"/>
+        </w:rPr>
+        <w:t>pip install -r requirements.txt</w:t>
+      </w:r>
+    </w:p>
+    <w:p>
+      <w:pPr>
+        <w:spacing w:before="400"/>
+        <w:rPr>
+          <w:sz w:val="18"/>
+          <w:szCs w:val="18"/>
+        </w:rPr>
+      </w:pPr>
     </w:p>
     <w:sectPr>
       <w:pgSz w:w="11906" w:h="16838"/>
@@ -7567,7 +7608,6 @@
   <w:style w:type="character" w:default="1" w:styleId="DefaultParagraphFont">
     <w:name w:val="Default Paragraph Font"/>
     <w:uiPriority w:val="1"/>
-    <w:semiHidden/>
     <w:unhideWhenUsed/>
   </w:style>
   <w:style w:type="table" w:default="1" w:styleId="TableNormal">

</xml_diff>